<commit_message>
Preenche autoria, curso e instituicao no artigo, no relatorio e no README
Dados informados pela equipe:
- Instituicao: Universidade de Franca (UNIFRAN), Franca, Sao Paulo, Brasil
- Curso: Ciencia da Computacao
- Integrantes (cinco de sete): Luiz Tonny Moura Santos; Vinicius Nunes Benedito;
  Kauan Henrique Teixeira; Pedro Henrique Pereira Boldrin; Mateus da Silva Vieira

O modelo institucional previa seis slots de autor; a equipe tem sete, de modo que
o bloco de autoria passou a sete linhas, com o 6o e o 7o integrantes ainda como
marcadores. Isso acrescentou uma linha ao relatorio, que vai de 30 para 31
paginas; a contagem no README foi atualizada.

Seguem como lacunas, listadas na secao 6 do README:
- nomes do 6o e do 7o integrantes;
- autor correspondente e respectivo e-mail;
- tabela de divisao de responsabilidades do Apendice A.

.docx regenerados e .pdf reconvertidos.
</commit_message>
<xml_diff>
--- a/06_artigo/ARTIGO_Modelagem_Preditiva_Calotas_Polares.docx
+++ b/06_artigo/ARTIGO_Modelagem_Preditiva_Calotas_Polares.docx
@@ -20,18 +20,50 @@
     </w:p>
     <w:p>
       <w:pPr>
-        <w:spacing w:before="0" w:after="60" w:line="240" w:lineRule="auto"/>
-        <w:ind w:firstLine="0"/>
-        <w:jc w:val="center"/>
+        <w:spacing w:before="0" w:after="120" w:line="360" w:lineRule="auto"/>
+        <w:ind w:firstLine="709"/>
+        <w:jc w:val="both"/>
       </w:pPr>
       <w:r>
         <w:rPr>
           <w:rFonts w:ascii="Arial" w:hAnsi="Arial" w:eastAsia="Arial" w:cs="Arial"/>
           <w:b w:val="0"/>
           <w:i w:val="0"/>
-          <w:sz w:val="22"/>
+          <w:sz w:val="24"/>
         </w:rPr>
-        <w:t>Nome Completo do Aluno 1¹; Nome Completo do Aluno 2¹; Nome Completo do Aluno 3¹;</w:t>
+        <w:t>Luiz Tonny Moura Santos¹; Vinícius Nunes Benedito¹; Kauan Henrique Teixeira¹;</w:t>
+      </w:r>
+    </w:p>
+    <w:p>
+      <w:pPr>
+        <w:spacing w:before="0" w:after="120" w:line="360" w:lineRule="auto"/>
+        <w:ind w:firstLine="709"/>
+        <w:jc w:val="both"/>
+      </w:pPr>
+      <w:r>
+        <w:rPr>
+          <w:rFonts w:ascii="Arial" w:hAnsi="Arial" w:eastAsia="Arial" w:cs="Arial"/>
+          <w:b w:val="0"/>
+          <w:i w:val="0"/>
+          <w:sz w:val="24"/>
+        </w:rPr>
+        <w:t>Pedro Henrique Pereira Boldrin¹; Mateus da Silva Vieira¹; [Nome completo do 6º integrante]¹;</w:t>
+      </w:r>
+    </w:p>
+    <w:p>
+      <w:pPr>
+        <w:spacing w:before="0" w:after="120" w:line="360" w:lineRule="auto"/>
+        <w:ind w:firstLine="709"/>
+        <w:jc w:val="both"/>
+      </w:pPr>
+      <w:r>
+        <w:rPr>
+          <w:rFonts w:ascii="Arial" w:hAnsi="Arial" w:eastAsia="Arial" w:cs="Arial"/>
+          <w:b w:val="0"/>
+          <w:i w:val="0"/>
+          <w:sz w:val="24"/>
+        </w:rPr>
+        <w:t>[Nome completo do 7º integrante]¹; Prof. Dr. Renato Gonçalves Rocha²</w:t>
       </w:r>
     </w:p>
     <w:p>
@@ -47,7 +79,7 @@
           <w:i w:val="0"/>
           <w:sz w:val="22"/>
         </w:rPr>
-        <w:t>Nome Completo do Aluno 4¹; Nome Completo do Aluno 5¹; Nome Completo do Aluno 6¹;</w:t>
+        <w:t>¹ Curso de Ciência da Computação, Universidade de Franca (UNIFRAN), Franca, São Paulo, Brasil.</w:t>
       </w:r>
     </w:p>
     <w:p>
@@ -63,39 +95,7 @@
           <w:i w:val="0"/>
           <w:sz w:val="22"/>
         </w:rPr>
-        <w:t>Prof. Dr. Renato Gonçalves Rocha²</w:t>
-      </w:r>
-    </w:p>
-    <w:p>
-      <w:pPr>
-        <w:spacing w:before="0" w:after="60" w:line="240" w:lineRule="auto"/>
-        <w:ind w:firstLine="0"/>
-        <w:jc w:val="center"/>
-      </w:pPr>
-      <w:r>
-        <w:rPr>
-          <w:rFonts w:ascii="Arial" w:hAnsi="Arial" w:eastAsia="Arial" w:cs="Arial"/>
-          <w:b w:val="0"/>
-          <w:i w:val="0"/>
-          <w:sz w:val="22"/>
-        </w:rPr>
-        <w:t>¹ Curso de ____________________, Nome da Instituição, Cidade, Estado, Brasil.</w:t>
-      </w:r>
-    </w:p>
-    <w:p>
-      <w:pPr>
-        <w:spacing w:before="0" w:after="60" w:line="240" w:lineRule="auto"/>
-        <w:ind w:firstLine="0"/>
-        <w:jc w:val="center"/>
-      </w:pPr>
-      <w:r>
-        <w:rPr>
-          <w:rFonts w:ascii="Arial" w:hAnsi="Arial" w:eastAsia="Arial" w:cs="Arial"/>
-          <w:b w:val="0"/>
-          <w:i w:val="0"/>
-          <w:sz w:val="22"/>
-        </w:rPr>
-        <w:t>² Professor Orientador, Nome da Instituição, Cidade, Estado, Brasil.</w:t>
+        <w:t>² Professor Orientador, Universidade de Franca (UNIFRAN), Franca, São Paulo, Brasil.</w:t>
       </w:r>
     </w:p>
     <w:p>

</xml_diff>

<commit_message>
Completa a autoria com os dois ultimos integrantes
Acrescentados Miguel Otavio Ferreira Martins e Joao Pedro Fernandes, fechando
os sete integrantes no artigo, no relatorio, no README e no portfolio. Nao
resta nenhum marcador de nome nos quatro.

.docx regenerados, .pdf do artigo e do relatorio reconvertidos, e o portfolio
reconstruido a partir dos slides (HTML autossuficiente e PDF em 1440 x 810 pt).
Paginacao inalterada: artigo 26, relatorio 31, portfolio 11.

Seguem como lacunas, na secao 6 do README: o autor correspondente com e-mail e
a tabela de divisao de responsabilidades do Apendice A.
</commit_message>
<xml_diff>
--- a/06_artigo/ARTIGO_Modelagem_Preditiva_Calotas_Polares.docx
+++ b/06_artigo/ARTIGO_Modelagem_Preditiva_Calotas_Polares.docx
@@ -47,7 +47,7 @@
           <w:i w:val="0"/>
           <w:sz w:val="24"/>
         </w:rPr>
-        <w:t>Pedro Henrique Pereira Boldrin¹; Mateus da Silva Vieira¹; [Nome completo do 6º integrante]¹;</w:t>
+        <w:t>Pedro Henrique Pereira Boldrin¹; Mateus da Silva Vieira¹; Miguel Otávio Ferreira Martins¹;</w:t>
       </w:r>
     </w:p>
     <w:p>
@@ -63,7 +63,7 @@
           <w:i w:val="0"/>
           <w:sz w:val="24"/>
         </w:rPr>
-        <w:t>[Nome completo do 7º integrante]¹; Prof. Dr. Renato Gonçalves Rocha²</w:t>
+        <w:t>João Pedro Fernandes¹; Prof. Dr. Renato Gonçalves Rocha²</w:t>
       </w:r>
     </w:p>
     <w:p>

</xml_diff>

<commit_message>
Ordena os integrantes alfabeticamente e define o autor correspondente
Os sete integrantes passam a aparecer em ordem alfabetica pelo primeiro nome,
no artigo, no relatorio, no README e na capa do portfolio. A ordenacao e pelo
primeiro nome porque os nomes sao exibidos na ordem direta: alfabetar pelo
sobrenome enquanto se exibe o nome primeiro faria a sequencia parecer aleatoria
ao leitor.

Autor correspondente: Miguel Otavio Ferreira Martins, com o e-mail informado
pela equipe. Com isso o bloco de autoria do Modelo Institucional fica completo;
resta apenas a tabela do Apendice A, registrada na secao 6 do README.

.docx regenerados, .pdf do artigo e do relatorio reconvertidos e portfolio
reconstruido. Paginacao inalterada: 26, 31 e 11.
</commit_message>
<xml_diff>
--- a/06_artigo/ARTIGO_Modelagem_Preditiva_Calotas_Polares.docx
+++ b/06_artigo/ARTIGO_Modelagem_Preditiva_Calotas_Polares.docx
@@ -31,7 +31,7 @@
           <w:i w:val="0"/>
           <w:sz w:val="24"/>
         </w:rPr>
-        <w:t>Luiz Tonny Moura Santos¹; Vinícius Nunes Benedito¹; Kauan Henrique Teixeira¹;</w:t>
+        <w:t>João Pedro Fernandes¹; Kauan Henrique Teixeira¹; Luiz Tonny Moura Santos¹;</w:t>
       </w:r>
     </w:p>
     <w:p>
@@ -47,7 +47,7 @@
           <w:i w:val="0"/>
           <w:sz w:val="24"/>
         </w:rPr>
-        <w:t>Pedro Henrique Pereira Boldrin¹; Mateus da Silva Vieira¹; Miguel Otávio Ferreira Martins¹;</w:t>
+        <w:t>Mateus da Silva Vieira¹; Miguel Otávio Ferreira Martins¹; Pedro Henrique Pereira Boldrin¹;</w:t>
       </w:r>
     </w:p>
     <w:p>
@@ -63,7 +63,7 @@
           <w:i w:val="0"/>
           <w:sz w:val="24"/>
         </w:rPr>
-        <w:t>João Pedro Fernandes¹; Prof. Dr. Renato Gonçalves Rocha²</w:t>
+        <w:t>Vinícius Nunes Benedito¹; Prof. Dr. Renato Gonçalves Rocha²</w:t>
       </w:r>
     </w:p>
     <w:p>
@@ -111,7 +111,7 @@
           <w:i w:val="0"/>
           <w:sz w:val="22"/>
         </w:rPr>
-        <w:t>Autor correspondente: ____________________ – e-mail: ____________________</w:t>
+        <w:t>Autor correspondente: Miguel Otávio Ferreira Martins – e-mail: miguelotavio018@gmail.com</w:t>
       </w:r>
     </w:p>
     <w:p>

</xml_diff>